<commit_message>
changement doc mail type
</commit_message>
<xml_diff>
--- a/frontend/src/assets/documents/mail_type.docx
+++ b/frontend/src/assets/documents/mail_type.docx
@@ -1,6 +1,6 @@
 
 <file path=word/document.xml><?xml version="1.0" encoding="utf-8"?>
-<w:document xmlns:wpc="http://schemas.microsoft.com/office/word/2010/wordprocessingCanvas" xmlns:cx="http://schemas.microsoft.com/office/drawing/2014/chartex" xmlns:cx1="http://schemas.microsoft.com/office/drawing/2015/9/8/chartex" xmlns:cx2="http://schemas.microsoft.com/office/drawing/2015/10/21/chartex" xmlns:cx3="http://schemas.microsoft.com/office/drawing/2016/5/9/chartex" xmlns:cx4="http://schemas.microsoft.com/office/drawing/2016/5/10/chartex" xmlns:cx5="http://schemas.microsoft.com/office/drawing/2016/5/11/chartex" xmlns:cx6="http://schemas.microsoft.com/office/drawing/2016/5/12/chartex" xmlns:cx7="http://schemas.microsoft.com/office/drawing/2016/5/13/chartex" xmlns:cx8="http://schemas.microsoft.com/office/drawing/2016/5/14/chartex" xmlns:mc="http://schemas.openxmlformats.org/markup-compatibility/2006" xmlns:aink="http://schemas.microsoft.com/office/drawing/2016/ink" xmlns:am3d="http://schemas.microsoft.com/office/drawing/2017/model3d" xmlns:o="urn:schemas-microsoft-com:office:office" xmlns:r="http://schemas.openxmlformats.org/officeDocument/2006/relationships" xmlns:m="http://schemas.openxmlformats.org/officeDocument/2006/math" xmlns:v="urn:schemas-microsoft-com:vml" xmlns:wp14="http://schemas.microsoft.com/office/word/2010/wordprocessingDrawing" xmlns:wp="http://schemas.openxmlformats.org/drawingml/2006/wordprocessingDrawing" xmlns:w10="urn:schemas-microsoft-com:office:word" xmlns:w="http://schemas.openxmlformats.org/wordprocessingml/2006/main" xmlns:w14="http://schemas.microsoft.com/office/word/2010/wordml" xmlns:w15="http://schemas.microsoft.com/office/word/2012/wordml" xmlns:w16cid="http://schemas.microsoft.com/office/word/2016/wordml/cid" xmlns:w16se="http://schemas.microsoft.com/office/word/2015/wordml/symex" xmlns:wpg="http://schemas.microsoft.com/office/word/2010/wordprocessingGroup" xmlns:wpi="http://schemas.microsoft.com/office/word/2010/wordprocessingInk" xmlns:wne="http://schemas.microsoft.com/office/word/2006/wordml" xmlns:wps="http://schemas.microsoft.com/office/word/2010/wordprocessingShape" mc:Ignorable="w14 w15 w16se w16cid wp14">
+<w:document xmlns:wpc="http://schemas.microsoft.com/office/word/2010/wordprocessingCanvas" xmlns:cx="http://schemas.microsoft.com/office/drawing/2014/chartex" xmlns:cx1="http://schemas.microsoft.com/office/drawing/2015/9/8/chartex" xmlns:cx2="http://schemas.microsoft.com/office/drawing/2015/10/21/chartex" xmlns:cx3="http://schemas.microsoft.com/office/drawing/2016/5/9/chartex" xmlns:cx4="http://schemas.microsoft.com/office/drawing/2016/5/10/chartex" xmlns:cx5="http://schemas.microsoft.com/office/drawing/2016/5/11/chartex" xmlns:cx6="http://schemas.microsoft.com/office/drawing/2016/5/12/chartex" xmlns:cx7="http://schemas.microsoft.com/office/drawing/2016/5/13/chartex" xmlns:cx8="http://schemas.microsoft.com/office/drawing/2016/5/14/chartex" xmlns:mc="http://schemas.openxmlformats.org/markup-compatibility/2006" xmlns:aink="http://schemas.microsoft.com/office/drawing/2016/ink" xmlns:am3d="http://schemas.microsoft.com/office/drawing/2017/model3d" xmlns:o="urn:schemas-microsoft-com:office:office" xmlns:oel="http://schemas.microsoft.com/office/2019/extlst" xmlns:r="http://schemas.openxmlformats.org/officeDocument/2006/relationships" xmlns:m="http://schemas.openxmlformats.org/officeDocument/2006/math" xmlns:v="urn:schemas-microsoft-com:vml" xmlns:wp14="http://schemas.microsoft.com/office/word/2010/wordprocessingDrawing" xmlns:wp="http://schemas.openxmlformats.org/drawingml/2006/wordprocessingDrawing" xmlns:w10="urn:schemas-microsoft-com:office:word" xmlns:w="http://schemas.openxmlformats.org/wordprocessingml/2006/main" xmlns:w14="http://schemas.microsoft.com/office/word/2010/wordml" xmlns:w15="http://schemas.microsoft.com/office/word/2012/wordml" xmlns:w16cex="http://schemas.microsoft.com/office/word/2018/wordml/cex" xmlns:w16cid="http://schemas.microsoft.com/office/word/2016/wordml/cid" xmlns:w16="http://schemas.microsoft.com/office/word/2018/wordml" xmlns:w16du="http://schemas.microsoft.com/office/word/2023/wordml/word16du" xmlns:w16sdtdh="http://schemas.microsoft.com/office/word/2020/wordml/sdtdatahash" xmlns:w16sdtfl="http://schemas.microsoft.com/office/word/2024/wordml/sdtformatlock" xmlns:w16se="http://schemas.microsoft.com/office/word/2015/wordml/symex" xmlns:wpg="http://schemas.microsoft.com/office/word/2010/wordprocessingGroup" xmlns:wpi="http://schemas.microsoft.com/office/word/2010/wordprocessingInk" xmlns:wne="http://schemas.microsoft.com/office/word/2006/wordml" xmlns:wps="http://schemas.microsoft.com/office/word/2010/wordprocessingShape" mc:Ignorable="w14 w15 w16se w16cid w16 w16cex w16sdtdh w16sdtfl w16du wp14">
   <w:body>
     <w:p>
       <w:r>
@@ -10,13 +10,8 @@
         <w:t>Objet :</w:t>
       </w:r>
       <w:r>
-        <w:t xml:space="preserve"> Enquête Ancrage territorial XX </w:t>
-      </w:r>
-      <w:proofErr w:type="spellStart"/>
-      <w:r>
-        <w:t>XX</w:t>
-      </w:r>
-      <w:proofErr w:type="spellEnd"/>
+        <w:t xml:space="preserve"> Enquête Ancrage territorial XX XX</w:t>
+      </w:r>
     </w:p>
     <w:p>
       <w:pPr>
@@ -44,21 +39,7 @@
         <w:rPr>
           <w:i/>
         </w:rPr>
-        <w:t xml:space="preserve">Dossier suivi par XX </w:t>
-      </w:r>
-      <w:proofErr w:type="spellStart"/>
-      <w:r>
-        <w:rPr>
-          <w:i/>
-        </w:rPr>
-        <w:t>XX</w:t>
-      </w:r>
-      <w:proofErr w:type="spellEnd"/>
-      <w:r>
-        <w:rPr>
-          <w:i/>
-        </w:rPr>
-        <w:t xml:space="preserve"> (statut)</w:t>
+        <w:t>Dossier suivi par XX XX (statut)</w:t>
       </w:r>
     </w:p>
     <w:p>
@@ -120,21 +101,7 @@
         <w:rPr>
           <w:b/>
         </w:rPr>
-        <w:t xml:space="preserve"> : Enquête sur l’ancrage territorial de la XX </w:t>
-      </w:r>
-      <w:proofErr w:type="spellStart"/>
-      <w:r>
-        <w:rPr>
-          <w:b/>
-        </w:rPr>
-        <w:t>XX</w:t>
-      </w:r>
-      <w:proofErr w:type="spellEnd"/>
-      <w:r>
-        <w:rPr>
-          <w:b/>
-        </w:rPr>
-        <w:t> / Entretiens ciblés.</w:t>
+        <w:t> : Enquête sur l’ancrage territorial de la XX XX / Entretiens ciblés.</w:t>
       </w:r>
     </w:p>
     <w:p>
@@ -153,6 +120,14 @@
     <w:p>
       <w:pPr>
         <w:jc w:val="both"/>
+        <w:rPr>
+          <w:b/>
+        </w:rPr>
+      </w:pPr>
+    </w:p>
+    <w:p>
+      <w:pPr>
+        <w:jc w:val="both"/>
       </w:pPr>
       <w:r>
         <w:rPr>
@@ -233,8 +208,6 @@
       <w:r>
         <w:t>l’aire protégée</w:t>
       </w:r>
-      <w:bookmarkStart w:id="0" w:name="_GoBack"/>
-      <w:bookmarkEnd w:id="0"/>
       <w:r>
         <w:t xml:space="preserve"> sur le territoire, la manière dont elle fonctionne avec (ou sans) les acteurs locaux et plus largement de discuter de l’aménagement durable du territoire et de la protection de son patrimoine naturel.</w:t>
       </w:r>
@@ -247,91 +220,74 @@
         <w:rPr>
           <w:b/>
         </w:rPr>
-        <w:t xml:space="preserve">Nous vous proposons de vous inscrire </w:t>
-      </w:r>
-      <w:r>
-        <w:t xml:space="preserve">à l’un des créneaux de l’agenda </w:t>
-      </w:r>
-      <w:proofErr w:type="spellStart"/>
-      <w:r>
-        <w:t>Framadate</w:t>
-      </w:r>
-      <w:proofErr w:type="spellEnd"/>
-      <w:r>
-        <w:t xml:space="preserve"> dont voici le lien : </w:t>
+        <w:t>XX XX</w:t>
+      </w:r>
+      <w:r>
+        <w:t>,</w:t>
+      </w:r>
+      <w:r>
+        <w:t xml:space="preserve"> l</w:t>
+      </w:r>
+      <w:r>
+        <w:t>e salarié/stagiaire chargé des entretiens (contact ci-dessus)</w:t>
+      </w:r>
+      <w:r>
+        <w:t xml:space="preserve"> </w:t>
+      </w:r>
+      <w:r>
+        <w:rPr>
+          <w:b/>
+        </w:rPr>
+        <w:t>v</w:t>
+      </w:r>
+      <w:r>
+        <w:rPr>
+          <w:b/>
+        </w:rPr>
+        <w:t>ous contacter</w:t>
+      </w:r>
+      <w:r>
+        <w:rPr>
+          <w:b/>
+        </w:rPr>
+        <w:t>a</w:t>
+      </w:r>
+      <w:r>
+        <w:t xml:space="preserve"> par mail ou bien par téléphone afin de convenir d’un rendez-vous. Si vous avez des questions ou bien des difficultés à remplir l’agenda, n’hésitez pas à le solliciter.</w:t>
       </w:r>
     </w:p>
     <w:p>
       <w:pPr>
         <w:jc w:val="both"/>
-        <w:rPr>
-          <w:rFonts w:ascii="Trebuchet MS" w:eastAsia="Trebuchet MS" w:hAnsi="Trebuchet MS" w:cs="Trebuchet MS"/>
-          <w:b/>
-          <w:color w:val="9900FF"/>
-          <w:sz w:val="20"/>
-          <w:szCs w:val="20"/>
-          <w:u w:val="single"/>
-        </w:rPr>
-      </w:pPr>
-      <w:r>
-        <w:rPr>
-          <w:rFonts w:ascii="Trebuchet MS" w:eastAsia="Trebuchet MS" w:hAnsi="Trebuchet MS" w:cs="Trebuchet MS"/>
-          <w:b/>
-          <w:color w:val="9900FF"/>
-          <w:sz w:val="20"/>
-          <w:szCs w:val="20"/>
-          <w:u w:val="single"/>
-        </w:rPr>
-        <w:t>XXXXXXXXXXXX</w:t>
-      </w:r>
-    </w:p>
-    <w:p>
-      <w:pPr>
-        <w:jc w:val="both"/>
-      </w:pPr>
-      <w:r>
-        <w:rPr>
-          <w:b/>
-        </w:rPr>
-        <w:t xml:space="preserve">Vous pouvez contacter XX </w:t>
-      </w:r>
-      <w:proofErr w:type="spellStart"/>
-      <w:r>
-        <w:rPr>
-          <w:b/>
-        </w:rPr>
-        <w:t>XX</w:t>
-      </w:r>
-      <w:proofErr w:type="spellEnd"/>
-      <w:r>
-        <w:t>, le salarié/stagiaire chargé des entretiens (contact ci-dessus), par mail ou bien par téléphone afin de convenir d’un rendez-vous. Si vous avez des questions ou bien des difficultés à remplir l’agenda, n’hésitez pas à le solliciter.</w:t>
-      </w:r>
-    </w:p>
-    <w:p>
-      <w:pPr>
-        <w:jc w:val="both"/>
-      </w:pPr>
-      <w:r>
-        <w:t xml:space="preserve">L’entretien dure environ 1h30 : il est possible de réserver une salle, ou bien XX </w:t>
-      </w:r>
-      <w:proofErr w:type="spellStart"/>
-      <w:r>
-        <w:t>XX</w:t>
-      </w:r>
-      <w:proofErr w:type="spellEnd"/>
-      <w:r>
-        <w:t xml:space="preserve"> peut se déplacer à votre domicile/lieu de travail.</w:t>
-      </w:r>
-    </w:p>
+      </w:pPr>
+      <w:r>
+        <w:t>L’entretien dure environ 1h30 : il est possible de réserver une salle, ou bien XX XX peut se déplacer à vot</w:t>
+      </w:r>
+      <w:r>
+        <w:t xml:space="preserve">re </w:t>
+      </w:r>
+      <w:r>
+        <w:t>lieu de travail.</w:t>
+      </w:r>
+    </w:p>
+    <w:p/>
     <w:p>
       <w:r>
         <w:t>Nous vous remercions pour votre écoute.</w:t>
       </w:r>
     </w:p>
+    <w:p/>
     <w:p>
       <w:r>
         <w:t>Avec ma meilleure considération.</w:t>
       </w:r>
+    </w:p>
+    <w:p>
+      <w:pPr>
+        <w:rPr>
+          <w:i/>
+        </w:rPr>
+      </w:pPr>
     </w:p>
     <w:p>
       <w:r>
@@ -354,7 +310,7 @@
 </file>
 
 <file path=word/endnotes.xml><?xml version="1.0" encoding="utf-8"?>
-<w:endnotes xmlns:wpc="http://schemas.microsoft.com/office/word/2010/wordprocessingCanvas" xmlns:cx="http://schemas.microsoft.com/office/drawing/2014/chartex" xmlns:cx1="http://schemas.microsoft.com/office/drawing/2015/9/8/chartex" xmlns:cx2="http://schemas.microsoft.com/office/drawing/2015/10/21/chartex" xmlns:cx3="http://schemas.microsoft.com/office/drawing/2016/5/9/chartex" xmlns:cx4="http://schemas.microsoft.com/office/drawing/2016/5/10/chartex" xmlns:cx5="http://schemas.microsoft.com/office/drawing/2016/5/11/chartex" xmlns:cx6="http://schemas.microsoft.com/office/drawing/2016/5/12/chartex" xmlns:cx7="http://schemas.microsoft.com/office/drawing/2016/5/13/chartex" xmlns:cx8="http://schemas.microsoft.com/office/drawing/2016/5/14/chartex" xmlns:mc="http://schemas.openxmlformats.org/markup-compatibility/2006" xmlns:aink="http://schemas.microsoft.com/office/drawing/2016/ink" xmlns:am3d="http://schemas.microsoft.com/office/drawing/2017/model3d" xmlns:o="urn:schemas-microsoft-com:office:office" xmlns:r="http://schemas.openxmlformats.org/officeDocument/2006/relationships" xmlns:m="http://schemas.openxmlformats.org/officeDocument/2006/math" xmlns:v="urn:schemas-microsoft-com:vml" xmlns:wp14="http://schemas.microsoft.com/office/word/2010/wordprocessingDrawing" xmlns:wp="http://schemas.openxmlformats.org/drawingml/2006/wordprocessingDrawing" xmlns:w10="urn:schemas-microsoft-com:office:word" xmlns:w="http://schemas.openxmlformats.org/wordprocessingml/2006/main" xmlns:w14="http://schemas.microsoft.com/office/word/2010/wordml" xmlns:w15="http://schemas.microsoft.com/office/word/2012/wordml" xmlns:w16cid="http://schemas.microsoft.com/office/word/2016/wordml/cid" xmlns:w16se="http://schemas.microsoft.com/office/word/2015/wordml/symex" xmlns:wpg="http://schemas.microsoft.com/office/word/2010/wordprocessingGroup" xmlns:wpi="http://schemas.microsoft.com/office/word/2010/wordprocessingInk" xmlns:wne="http://schemas.microsoft.com/office/word/2006/wordml" xmlns:wps="http://schemas.microsoft.com/office/word/2010/wordprocessingShape" mc:Ignorable="w14 w15 w16se w16cid wp14">
+<w:endnotes xmlns:wpc="http://schemas.microsoft.com/office/word/2010/wordprocessingCanvas" xmlns:cx="http://schemas.microsoft.com/office/drawing/2014/chartex" xmlns:cx1="http://schemas.microsoft.com/office/drawing/2015/9/8/chartex" xmlns:cx2="http://schemas.microsoft.com/office/drawing/2015/10/21/chartex" xmlns:cx3="http://schemas.microsoft.com/office/drawing/2016/5/9/chartex" xmlns:cx4="http://schemas.microsoft.com/office/drawing/2016/5/10/chartex" xmlns:cx5="http://schemas.microsoft.com/office/drawing/2016/5/11/chartex" xmlns:cx6="http://schemas.microsoft.com/office/drawing/2016/5/12/chartex" xmlns:cx7="http://schemas.microsoft.com/office/drawing/2016/5/13/chartex" xmlns:cx8="http://schemas.microsoft.com/office/drawing/2016/5/14/chartex" xmlns:mc="http://schemas.openxmlformats.org/markup-compatibility/2006" xmlns:aink="http://schemas.microsoft.com/office/drawing/2016/ink" xmlns:am3d="http://schemas.microsoft.com/office/drawing/2017/model3d" xmlns:o="urn:schemas-microsoft-com:office:office" xmlns:oel="http://schemas.microsoft.com/office/2019/extlst" xmlns:r="http://schemas.openxmlformats.org/officeDocument/2006/relationships" xmlns:m="http://schemas.openxmlformats.org/officeDocument/2006/math" xmlns:v="urn:schemas-microsoft-com:vml" xmlns:wp14="http://schemas.microsoft.com/office/word/2010/wordprocessingDrawing" xmlns:wp="http://schemas.openxmlformats.org/drawingml/2006/wordprocessingDrawing" xmlns:w10="urn:schemas-microsoft-com:office:word" xmlns:w="http://schemas.openxmlformats.org/wordprocessingml/2006/main" xmlns:w14="http://schemas.microsoft.com/office/word/2010/wordml" xmlns:w15="http://schemas.microsoft.com/office/word/2012/wordml" xmlns:w16cex="http://schemas.microsoft.com/office/word/2018/wordml/cex" xmlns:w16cid="http://schemas.microsoft.com/office/word/2016/wordml/cid" xmlns:w16="http://schemas.microsoft.com/office/word/2018/wordml" xmlns:w16du="http://schemas.microsoft.com/office/word/2023/wordml/word16du" xmlns:w16sdtdh="http://schemas.microsoft.com/office/word/2020/wordml/sdtdatahash" xmlns:w16sdtfl="http://schemas.microsoft.com/office/word/2024/wordml/sdtformatlock" xmlns:w16se="http://schemas.microsoft.com/office/word/2015/wordml/symex" xmlns:wpg="http://schemas.microsoft.com/office/word/2010/wordprocessingGroup" xmlns:wpi="http://schemas.microsoft.com/office/word/2010/wordprocessingInk" xmlns:wne="http://schemas.microsoft.com/office/word/2006/wordml" xmlns:wps="http://schemas.microsoft.com/office/word/2010/wordprocessingShape" mc:Ignorable="w14 w15 w16se w16cid w16 w16cex w16sdtdh w16sdtfl w16du wp14">
   <w:endnote w:type="separator" w:id="-1">
     <w:p>
       <w:pPr>
@@ -379,7 +335,7 @@
 </file>
 
 <file path=word/footer1.xml><?xml version="1.0" encoding="utf-8"?>
-<w:ftr xmlns:wpc="http://schemas.microsoft.com/office/word/2010/wordprocessingCanvas" xmlns:cx="http://schemas.microsoft.com/office/drawing/2014/chartex" xmlns:cx1="http://schemas.microsoft.com/office/drawing/2015/9/8/chartex" xmlns:cx2="http://schemas.microsoft.com/office/drawing/2015/10/21/chartex" xmlns:cx3="http://schemas.microsoft.com/office/drawing/2016/5/9/chartex" xmlns:cx4="http://schemas.microsoft.com/office/drawing/2016/5/10/chartex" xmlns:cx5="http://schemas.microsoft.com/office/drawing/2016/5/11/chartex" xmlns:cx6="http://schemas.microsoft.com/office/drawing/2016/5/12/chartex" xmlns:cx7="http://schemas.microsoft.com/office/drawing/2016/5/13/chartex" xmlns:cx8="http://schemas.microsoft.com/office/drawing/2016/5/14/chartex" xmlns:mc="http://schemas.openxmlformats.org/markup-compatibility/2006" xmlns:aink="http://schemas.microsoft.com/office/drawing/2016/ink" xmlns:am3d="http://schemas.microsoft.com/office/drawing/2017/model3d" xmlns:o="urn:schemas-microsoft-com:office:office" xmlns:r="http://schemas.openxmlformats.org/officeDocument/2006/relationships" xmlns:m="http://schemas.openxmlformats.org/officeDocument/2006/math" xmlns:v="urn:schemas-microsoft-com:vml" xmlns:wp14="http://schemas.microsoft.com/office/word/2010/wordprocessingDrawing" xmlns:wp="http://schemas.openxmlformats.org/drawingml/2006/wordprocessingDrawing" xmlns:w10="urn:schemas-microsoft-com:office:word" xmlns:w="http://schemas.openxmlformats.org/wordprocessingml/2006/main" xmlns:w14="http://schemas.microsoft.com/office/word/2010/wordml" xmlns:w15="http://schemas.microsoft.com/office/word/2012/wordml" xmlns:w16cid="http://schemas.microsoft.com/office/word/2016/wordml/cid" xmlns:w16se="http://schemas.microsoft.com/office/word/2015/wordml/symex" xmlns:wpg="http://schemas.microsoft.com/office/word/2010/wordprocessingGroup" xmlns:wpi="http://schemas.microsoft.com/office/word/2010/wordprocessingInk" xmlns:wne="http://schemas.microsoft.com/office/word/2006/wordml" xmlns:wps="http://schemas.microsoft.com/office/word/2010/wordprocessingShape" mc:Ignorable="w14 w15 w16se w16cid wp14">
+<w:ftr xmlns:wpc="http://schemas.microsoft.com/office/word/2010/wordprocessingCanvas" xmlns:cx="http://schemas.microsoft.com/office/drawing/2014/chartex" xmlns:cx1="http://schemas.microsoft.com/office/drawing/2015/9/8/chartex" xmlns:cx2="http://schemas.microsoft.com/office/drawing/2015/10/21/chartex" xmlns:cx3="http://schemas.microsoft.com/office/drawing/2016/5/9/chartex" xmlns:cx4="http://schemas.microsoft.com/office/drawing/2016/5/10/chartex" xmlns:cx5="http://schemas.microsoft.com/office/drawing/2016/5/11/chartex" xmlns:cx6="http://schemas.microsoft.com/office/drawing/2016/5/12/chartex" xmlns:cx7="http://schemas.microsoft.com/office/drawing/2016/5/13/chartex" xmlns:cx8="http://schemas.microsoft.com/office/drawing/2016/5/14/chartex" xmlns:mc="http://schemas.openxmlformats.org/markup-compatibility/2006" xmlns:aink="http://schemas.microsoft.com/office/drawing/2016/ink" xmlns:am3d="http://schemas.microsoft.com/office/drawing/2017/model3d" xmlns:o="urn:schemas-microsoft-com:office:office" xmlns:oel="http://schemas.microsoft.com/office/2019/extlst" xmlns:r="http://schemas.openxmlformats.org/officeDocument/2006/relationships" xmlns:m="http://schemas.openxmlformats.org/officeDocument/2006/math" xmlns:v="urn:schemas-microsoft-com:vml" xmlns:wp14="http://schemas.microsoft.com/office/word/2010/wordprocessingDrawing" xmlns:wp="http://schemas.openxmlformats.org/drawingml/2006/wordprocessingDrawing" xmlns:w10="urn:schemas-microsoft-com:office:word" xmlns:w="http://schemas.openxmlformats.org/wordprocessingml/2006/main" xmlns:w14="http://schemas.microsoft.com/office/word/2010/wordml" xmlns:w15="http://schemas.microsoft.com/office/word/2012/wordml" xmlns:w16cex="http://schemas.microsoft.com/office/word/2018/wordml/cex" xmlns:w16cid="http://schemas.microsoft.com/office/word/2016/wordml/cid" xmlns:w16="http://schemas.microsoft.com/office/word/2018/wordml" xmlns:w16du="http://schemas.microsoft.com/office/word/2023/wordml/word16du" xmlns:w16sdtdh="http://schemas.microsoft.com/office/word/2020/wordml/sdtdatahash" xmlns:w16sdtfl="http://schemas.microsoft.com/office/word/2024/wordml/sdtformatlock" xmlns:w16se="http://schemas.microsoft.com/office/word/2015/wordml/symex" xmlns:wpg="http://schemas.microsoft.com/office/word/2010/wordprocessingGroup" xmlns:wpi="http://schemas.microsoft.com/office/word/2010/wordprocessingInk" xmlns:wne="http://schemas.microsoft.com/office/word/2006/wordml" xmlns:wps="http://schemas.microsoft.com/office/word/2010/wordprocessingShape" mc:Ignorable="w14 w15 w16se w16cid w16 w16cex w16sdtdh w16sdtfl w16du wp14">
   <w:p>
     <w:pPr>
       <w:pBdr>
@@ -445,7 +401,7 @@
 </file>
 
 <file path=word/footnotes.xml><?xml version="1.0" encoding="utf-8"?>
-<w:footnotes xmlns:wpc="http://schemas.microsoft.com/office/word/2010/wordprocessingCanvas" xmlns:cx="http://schemas.microsoft.com/office/drawing/2014/chartex" xmlns:cx1="http://schemas.microsoft.com/office/drawing/2015/9/8/chartex" xmlns:cx2="http://schemas.microsoft.com/office/drawing/2015/10/21/chartex" xmlns:cx3="http://schemas.microsoft.com/office/drawing/2016/5/9/chartex" xmlns:cx4="http://schemas.microsoft.com/office/drawing/2016/5/10/chartex" xmlns:cx5="http://schemas.microsoft.com/office/drawing/2016/5/11/chartex" xmlns:cx6="http://schemas.microsoft.com/office/drawing/2016/5/12/chartex" xmlns:cx7="http://schemas.microsoft.com/office/drawing/2016/5/13/chartex" xmlns:cx8="http://schemas.microsoft.com/office/drawing/2016/5/14/chartex" xmlns:mc="http://schemas.openxmlformats.org/markup-compatibility/2006" xmlns:aink="http://schemas.microsoft.com/office/drawing/2016/ink" xmlns:am3d="http://schemas.microsoft.com/office/drawing/2017/model3d" xmlns:o="urn:schemas-microsoft-com:office:office" xmlns:r="http://schemas.openxmlformats.org/officeDocument/2006/relationships" xmlns:m="http://schemas.openxmlformats.org/officeDocument/2006/math" xmlns:v="urn:schemas-microsoft-com:vml" xmlns:wp14="http://schemas.microsoft.com/office/word/2010/wordprocessingDrawing" xmlns:wp="http://schemas.openxmlformats.org/drawingml/2006/wordprocessingDrawing" xmlns:w10="urn:schemas-microsoft-com:office:word" xmlns:w="http://schemas.openxmlformats.org/wordprocessingml/2006/main" xmlns:w14="http://schemas.microsoft.com/office/word/2010/wordml" xmlns:w15="http://schemas.microsoft.com/office/word/2012/wordml" xmlns:w16cid="http://schemas.microsoft.com/office/word/2016/wordml/cid" xmlns:w16se="http://schemas.microsoft.com/office/word/2015/wordml/symex" xmlns:wpg="http://schemas.microsoft.com/office/word/2010/wordprocessingGroup" xmlns:wpi="http://schemas.microsoft.com/office/word/2010/wordprocessingInk" xmlns:wne="http://schemas.microsoft.com/office/word/2006/wordml" xmlns:wps="http://schemas.microsoft.com/office/word/2010/wordprocessingShape" mc:Ignorable="w14 w15 w16se w16cid wp14">
+<w:footnotes xmlns:wpc="http://schemas.microsoft.com/office/word/2010/wordprocessingCanvas" xmlns:cx="http://schemas.microsoft.com/office/drawing/2014/chartex" xmlns:cx1="http://schemas.microsoft.com/office/drawing/2015/9/8/chartex" xmlns:cx2="http://schemas.microsoft.com/office/drawing/2015/10/21/chartex" xmlns:cx3="http://schemas.microsoft.com/office/drawing/2016/5/9/chartex" xmlns:cx4="http://schemas.microsoft.com/office/drawing/2016/5/10/chartex" xmlns:cx5="http://schemas.microsoft.com/office/drawing/2016/5/11/chartex" xmlns:cx6="http://schemas.microsoft.com/office/drawing/2016/5/12/chartex" xmlns:cx7="http://schemas.microsoft.com/office/drawing/2016/5/13/chartex" xmlns:cx8="http://schemas.microsoft.com/office/drawing/2016/5/14/chartex" xmlns:mc="http://schemas.openxmlformats.org/markup-compatibility/2006" xmlns:aink="http://schemas.microsoft.com/office/drawing/2016/ink" xmlns:am3d="http://schemas.microsoft.com/office/drawing/2017/model3d" xmlns:o="urn:schemas-microsoft-com:office:office" xmlns:oel="http://schemas.microsoft.com/office/2019/extlst" xmlns:r="http://schemas.openxmlformats.org/officeDocument/2006/relationships" xmlns:m="http://schemas.openxmlformats.org/officeDocument/2006/math" xmlns:v="urn:schemas-microsoft-com:vml" xmlns:wp14="http://schemas.microsoft.com/office/word/2010/wordprocessingDrawing" xmlns:wp="http://schemas.openxmlformats.org/drawingml/2006/wordprocessingDrawing" xmlns:w10="urn:schemas-microsoft-com:office:word" xmlns:w="http://schemas.openxmlformats.org/wordprocessingml/2006/main" xmlns:w14="http://schemas.microsoft.com/office/word/2010/wordml" xmlns:w15="http://schemas.microsoft.com/office/word/2012/wordml" xmlns:w16cex="http://schemas.microsoft.com/office/word/2018/wordml/cex" xmlns:w16cid="http://schemas.microsoft.com/office/word/2016/wordml/cid" xmlns:w16="http://schemas.microsoft.com/office/word/2018/wordml" xmlns:w16du="http://schemas.microsoft.com/office/word/2023/wordml/word16du" xmlns:w16sdtdh="http://schemas.microsoft.com/office/word/2020/wordml/sdtdatahash" xmlns:w16sdtfl="http://schemas.microsoft.com/office/word/2024/wordml/sdtformatlock" xmlns:w16se="http://schemas.microsoft.com/office/word/2015/wordml/symex" xmlns:wpg="http://schemas.microsoft.com/office/word/2010/wordprocessingGroup" xmlns:wpi="http://schemas.microsoft.com/office/word/2010/wordprocessingInk" xmlns:wne="http://schemas.microsoft.com/office/word/2006/wordml" xmlns:wps="http://schemas.microsoft.com/office/word/2010/wordprocessingShape" mc:Ignorable="w14 w15 w16se w16cid w16 w16cex w16sdtdh w16sdtfl w16du wp14">
   <w:footnote w:type="separator" w:id="-1">
     <w:p>
       <w:pPr>
@@ -470,7 +426,7 @@
 </file>
 
 <file path=word/header1.xml><?xml version="1.0" encoding="utf-8"?>
-<w:hdr xmlns:wpc="http://schemas.microsoft.com/office/word/2010/wordprocessingCanvas" xmlns:cx="http://schemas.microsoft.com/office/drawing/2014/chartex" xmlns:cx1="http://schemas.microsoft.com/office/drawing/2015/9/8/chartex" xmlns:cx2="http://schemas.microsoft.com/office/drawing/2015/10/21/chartex" xmlns:cx3="http://schemas.microsoft.com/office/drawing/2016/5/9/chartex" xmlns:cx4="http://schemas.microsoft.com/office/drawing/2016/5/10/chartex" xmlns:cx5="http://schemas.microsoft.com/office/drawing/2016/5/11/chartex" xmlns:cx6="http://schemas.microsoft.com/office/drawing/2016/5/12/chartex" xmlns:cx7="http://schemas.microsoft.com/office/drawing/2016/5/13/chartex" xmlns:cx8="http://schemas.microsoft.com/office/drawing/2016/5/14/chartex" xmlns:mc="http://schemas.openxmlformats.org/markup-compatibility/2006" xmlns:aink="http://schemas.microsoft.com/office/drawing/2016/ink" xmlns:am3d="http://schemas.microsoft.com/office/drawing/2017/model3d" xmlns:o="urn:schemas-microsoft-com:office:office" xmlns:r="http://schemas.openxmlformats.org/officeDocument/2006/relationships" xmlns:m="http://schemas.openxmlformats.org/officeDocument/2006/math" xmlns:v="urn:schemas-microsoft-com:vml" xmlns:wp14="http://schemas.microsoft.com/office/word/2010/wordprocessingDrawing" xmlns:wp="http://schemas.openxmlformats.org/drawingml/2006/wordprocessingDrawing" xmlns:w10="urn:schemas-microsoft-com:office:word" xmlns:w="http://schemas.openxmlformats.org/wordprocessingml/2006/main" xmlns:w14="http://schemas.microsoft.com/office/word/2010/wordml" xmlns:w15="http://schemas.microsoft.com/office/word/2012/wordml" xmlns:w16cid="http://schemas.microsoft.com/office/word/2016/wordml/cid" xmlns:w16se="http://schemas.microsoft.com/office/word/2015/wordml/symex" xmlns:wpg="http://schemas.microsoft.com/office/word/2010/wordprocessingGroup" xmlns:wpi="http://schemas.microsoft.com/office/word/2010/wordprocessingInk" xmlns:wne="http://schemas.microsoft.com/office/word/2006/wordml" xmlns:wps="http://schemas.microsoft.com/office/word/2010/wordprocessingShape" mc:Ignorable="w14 w15 w16se w16cid wp14">
+<w:hdr xmlns:wpc="http://schemas.microsoft.com/office/word/2010/wordprocessingCanvas" xmlns:cx="http://schemas.microsoft.com/office/drawing/2014/chartex" xmlns:cx1="http://schemas.microsoft.com/office/drawing/2015/9/8/chartex" xmlns:cx2="http://schemas.microsoft.com/office/drawing/2015/10/21/chartex" xmlns:cx3="http://schemas.microsoft.com/office/drawing/2016/5/9/chartex" xmlns:cx4="http://schemas.microsoft.com/office/drawing/2016/5/10/chartex" xmlns:cx5="http://schemas.microsoft.com/office/drawing/2016/5/11/chartex" xmlns:cx6="http://schemas.microsoft.com/office/drawing/2016/5/12/chartex" xmlns:cx7="http://schemas.microsoft.com/office/drawing/2016/5/13/chartex" xmlns:cx8="http://schemas.microsoft.com/office/drawing/2016/5/14/chartex" xmlns:mc="http://schemas.openxmlformats.org/markup-compatibility/2006" xmlns:aink="http://schemas.microsoft.com/office/drawing/2016/ink" xmlns:am3d="http://schemas.microsoft.com/office/drawing/2017/model3d" xmlns:o="urn:schemas-microsoft-com:office:office" xmlns:oel="http://schemas.microsoft.com/office/2019/extlst" xmlns:r="http://schemas.openxmlformats.org/officeDocument/2006/relationships" xmlns:m="http://schemas.openxmlformats.org/officeDocument/2006/math" xmlns:v="urn:schemas-microsoft-com:vml" xmlns:wp14="http://schemas.microsoft.com/office/word/2010/wordprocessingDrawing" xmlns:wp="http://schemas.openxmlformats.org/drawingml/2006/wordprocessingDrawing" xmlns:w10="urn:schemas-microsoft-com:office:word" xmlns:w="http://schemas.openxmlformats.org/wordprocessingml/2006/main" xmlns:w14="http://schemas.microsoft.com/office/word/2010/wordml" xmlns:w15="http://schemas.microsoft.com/office/word/2012/wordml" xmlns:w16cex="http://schemas.microsoft.com/office/word/2018/wordml/cex" xmlns:w16cid="http://schemas.microsoft.com/office/word/2016/wordml/cid" xmlns:w16="http://schemas.microsoft.com/office/word/2018/wordml" xmlns:w16du="http://schemas.microsoft.com/office/word/2023/wordml/word16du" xmlns:w16sdtdh="http://schemas.microsoft.com/office/word/2020/wordml/sdtdatahash" xmlns:w16sdtfl="http://schemas.microsoft.com/office/word/2024/wordml/sdtformatlock" xmlns:w16se="http://schemas.microsoft.com/office/word/2015/wordml/symex" xmlns:wpg="http://schemas.microsoft.com/office/word/2010/wordprocessingGroup" xmlns:wpi="http://schemas.microsoft.com/office/word/2010/wordprocessingInk" xmlns:wne="http://schemas.microsoft.com/office/word/2006/wordml" xmlns:wps="http://schemas.microsoft.com/office/word/2010/wordprocessingShape" mc:Ignorable="w14 w15 w16se w16cid w16 w16cex w16sdtdh w16sdtfl w16du wp14">
   <w:p>
     <w:pPr>
       <w:pStyle w:val="Pieddepage"/>
@@ -484,7 +440,7 @@
         <w:noProof/>
       </w:rPr>
       <w:drawing>
-        <wp:anchor distT="0" distB="0" distL="114300" distR="114300" simplePos="0" relativeHeight="251657216" behindDoc="1" locked="0" layoutInCell="1" allowOverlap="1">
+        <wp:anchor distT="0" distB="0" distL="114300" distR="114300" simplePos="0" relativeHeight="251657216" behindDoc="1" locked="0" layoutInCell="1" allowOverlap="1" wp14:anchorId="15899442" wp14:editId="5A095289">
           <wp:simplePos x="0" y="0"/>
           <wp:positionH relativeFrom="column">
             <wp:posOffset>1062355</wp:posOffset>
@@ -548,7 +504,7 @@
         <w:noProof/>
       </w:rPr>
       <w:drawing>
-        <wp:anchor distT="0" distB="0" distL="114300" distR="114300" simplePos="0" relativeHeight="251658240" behindDoc="1" locked="0" layoutInCell="1" allowOverlap="1">
+        <wp:anchor distT="0" distB="0" distL="114300" distR="114300" simplePos="0" relativeHeight="251658240" behindDoc="1" locked="0" layoutInCell="1" allowOverlap="1" wp14:anchorId="32B03234" wp14:editId="2C82C5F7">
           <wp:simplePos x="0" y="0"/>
           <wp:positionH relativeFrom="column">
             <wp:posOffset>3643630</wp:posOffset>
@@ -641,7 +597,7 @@
 </file>
 
 <file path=word/styles.xml><?xml version="1.0" encoding="utf-8"?>
-<w:styles xmlns:mc="http://schemas.openxmlformats.org/markup-compatibility/2006" xmlns:r="http://schemas.openxmlformats.org/officeDocument/2006/relationships" xmlns:w="http://schemas.openxmlformats.org/wordprocessingml/2006/main" xmlns:w14="http://schemas.microsoft.com/office/word/2010/wordml" xmlns:w15="http://schemas.microsoft.com/office/word/2012/wordml" xmlns:w16cid="http://schemas.microsoft.com/office/word/2016/wordml/cid" xmlns:w16se="http://schemas.microsoft.com/office/word/2015/wordml/symex" mc:Ignorable="w14 w15 w16se w16cid">
+<w:styles xmlns:mc="http://schemas.openxmlformats.org/markup-compatibility/2006" xmlns:r="http://schemas.openxmlformats.org/officeDocument/2006/relationships" xmlns:w="http://schemas.openxmlformats.org/wordprocessingml/2006/main" xmlns:w14="http://schemas.microsoft.com/office/word/2010/wordml" xmlns:w15="http://schemas.microsoft.com/office/word/2012/wordml" xmlns:w16cex="http://schemas.microsoft.com/office/word/2018/wordml/cex" xmlns:w16cid="http://schemas.microsoft.com/office/word/2016/wordml/cid" xmlns:w16="http://schemas.microsoft.com/office/word/2018/wordml" xmlns:w16du="http://schemas.microsoft.com/office/word/2023/wordml/word16du" xmlns:w16sdtdh="http://schemas.microsoft.com/office/word/2020/wordml/sdtdatahash" xmlns:w16sdtfl="http://schemas.microsoft.com/office/word/2024/wordml/sdtformatlock" xmlns:w16se="http://schemas.microsoft.com/office/word/2015/wordml/symex" mc:Ignorable="w14 w15 w16se w16cid w16 w16cex w16sdtdh w16sdtfl w16du">
   <w:docDefaults>
     <w:rPrDefault>
       <w:rPr>
@@ -657,7 +613,7 @@
       </w:pPr>
     </w:pPrDefault>
   </w:docDefaults>
-  <w:latentStyles w:defLockedState="0" w:defUIPriority="99" w:defSemiHidden="0" w:defUnhideWhenUsed="0" w:defQFormat="0" w:count="375">
+  <w:latentStyles w:defLockedState="0" w:defUIPriority="99" w:defSemiHidden="0" w:defUnhideWhenUsed="0" w:defQFormat="0" w:count="376">
     <w:lsdException w:name="Normal" w:uiPriority="0" w:qFormat="1"/>
     <w:lsdException w:name="heading 1" w:uiPriority="9" w:qFormat="1"/>
     <w:lsdException w:name="heading 2" w:semiHidden="1" w:uiPriority="9" w:unhideWhenUsed="1" w:qFormat="1"/>
@@ -763,6 +719,7 @@
     <w:lsdException w:name="HTML Sample" w:semiHidden="1" w:unhideWhenUsed="1"/>
     <w:lsdException w:name="HTML Typewriter" w:semiHidden="1" w:unhideWhenUsed="1"/>
     <w:lsdException w:name="HTML Variable" w:semiHidden="1" w:unhideWhenUsed="1"/>
+    <w:lsdException w:name="Normal Table" w:semiHidden="1" w:unhideWhenUsed="1"/>
     <w:lsdException w:name="annotation subject" w:semiHidden="1" w:unhideWhenUsed="1"/>
     <w:lsdException w:name="No List" w:semiHidden="1" w:unhideWhenUsed="1"/>
     <w:lsdException w:name="Outline List 1" w:semiHidden="1" w:unhideWhenUsed="1"/>
@@ -806,8 +763,10 @@
     <w:lsdException w:name="Table Elegant" w:semiHidden="1" w:unhideWhenUsed="1"/>
     <w:lsdException w:name="Table Professional" w:semiHidden="1" w:unhideWhenUsed="1"/>
     <w:lsdException w:name="Table Subtle 1" w:semiHidden="1" w:unhideWhenUsed="1"/>
+    <w:lsdException w:name="Table Subtle 2" w:semiHidden="1" w:unhideWhenUsed="1"/>
     <w:lsdException w:name="Table Web 1" w:semiHidden="1" w:unhideWhenUsed="1"/>
     <w:lsdException w:name="Table Web 2" w:semiHidden="1" w:unhideWhenUsed="1"/>
+    <w:lsdException w:name="Table Web 3" w:semiHidden="1" w:unhideWhenUsed="1"/>
     <w:lsdException w:name="Balloon Text" w:semiHidden="1" w:unhideWhenUsed="1"/>
     <w:lsdException w:name="Table Grid" w:uiPriority="39"/>
     <w:lsdException w:name="Table Theme" w:semiHidden="1" w:unhideWhenUsed="1"/>
@@ -1030,6 +989,7 @@
     <w:lsdException w:name="Smart Hyperlink" w:semiHidden="1" w:unhideWhenUsed="1"/>
     <w:lsdException w:name="Hashtag" w:semiHidden="1" w:unhideWhenUsed="1"/>
     <w:lsdException w:name="Unresolved Mention" w:semiHidden="1" w:unhideWhenUsed="1"/>
+    <w:lsdException w:name="Smart Link" w:semiHidden="1" w:unhideWhenUsed="1"/>
   </w:latentStyles>
   <w:style w:type="paragraph" w:default="1" w:styleId="Normal">
     <w:name w:val="Normal"/>

</xml_diff>